<commit_message>
Adiciona DOI do Zenodo ao README, CITATION e manual.
</commit_message>
<xml_diff>
--- a/Metodo_ALVOR_v1_0.docx
+++ b/Metodo_ALVOR_v1_0.docx
@@ -186,7 +186,7 @@
           <w:sz w:val="22"/>
           <w:szCs w:val="22"/>
         </w:rPr>
-        <w:t xml:space="preserve">Versão 1.0 · Outubro de 2026</w:t>
+        <w:t xml:space="preserve">Versão 1.0.1 · Outubro de 2026</w:t>
       </w:r>
     </w:p>
     <w:p>
@@ -224,7 +224,7 @@
         <w:rPr>
           <w:rFonts w:ascii="Calibri" w:cs="Calibri" w:eastAsia="Calibri" w:hAnsi="Calibri"/>
         </w:rPr>
-        <w:t xml:space="preserve">Licença: Creative Commons BY-NC-SA 4.0, no mesmo espírito de gratuidade permanente dos Métodos O.R.P. e R.O.T.A. O DOI será registrado no Zenodo; o campo abaixo fica reservado para quando ele for gerado.</w:t>
+        <w:t xml:space="preserve">Licença: Creative Commons BY-NC-SA 4.0, no mesmo espírito de gratuidade permanente dos Métodos O.R.P. e R.O.T.A. O DOI está registrado no Zenodo e consta no campo abaixo.</w:t>
       </w:r>
     </w:p>
     <w:tbl>
@@ -328,7 +328,7 @@
               <w:rPr>
                 <w:rFonts w:ascii="Calibri" w:cs="Calibri" w:eastAsia="Calibri" w:hAnsi="Calibri"/>
               </w:rPr>
-              <w:t xml:space="preserve"> [reservado — será preenchido após o registro no Zenodo]</w:t>
+              <w:t xml:space="preserve"> https://doi.org/10.5281/zenodo.23486871 (ORCID: 0000-0001-8556-4195)</w:t>
             </w:r>
           </w:p>
           <w:p>
@@ -349,7 +349,7 @@
               <w:rPr>
                 <w:rFonts w:ascii="Calibri" w:cs="Calibri" w:eastAsia="Calibri" w:hAnsi="Calibri"/>
               </w:rPr>
-              <w:t xml:space="preserve"> Pereira, K. K. E. Método A.L.V.O.R. — Estudar para o ENEM em casa sem se perder pelo caminho: Manual de Método e Fichário de Prompts para Estudantes do ENEM [Computer software]. Zenodo. [DOI a ser inserido]</w:t>
+              <w:t xml:space="preserve"> Pereira, K. K. E. (2026). Método A.L.V.O.R. — Estudar para o ENEM em casa sem se perder pelo caminho: Manual de Método e Fichário de Prompts para Estudantes do ENEM (Version v1.0.0) [Computer software]. Zenodo. https://doi.org/10.5281/zenodo.23486871</w:t>
             </w:r>
           </w:p>
         </w:tc>
@@ -8537,6 +8537,107 @@
                 <w:szCs w:val="21"/>
               </w:rPr>
               <w:t xml:space="preserve">Primeira edição: Fases 1 a 10, duas portas de entrada, Bloco de Sustentação, trilha TDAH, adaptações para estudantes surdos e com deficiência, calendário semanal.</w:t>
+            </w:r>
+          </w:p>
+        </w:tc>
+      </w:tr>
+      <w:tr>
+        <w:trPr>
+          <w:cantSplit/>
+        </w:trPr>
+        <w:tc>
+          <w:tcPr>
+            <w:tcW w:type="dxa" w:w="1300"/>
+            <w:tcBorders>
+              <w:top w:val="single" w:color="BBB5A8" w:sz="4"/>
+              <w:left w:val="single" w:color="BBB5A8" w:sz="4"/>
+              <w:bottom w:val="single" w:color="BBB5A8" w:sz="4"/>
+              <w:right w:val="single" w:color="BBB5A8" w:sz="4"/>
+            </w:tcBorders>
+            <w:tcMar>
+              <w:top w:type="dxa" w:w="70"/>
+              <w:left w:type="dxa" w:w="110"/>
+              <w:bottom w:type="dxa" w:w="70"/>
+              <w:right w:type="dxa" w:w="110"/>
+            </w:tcMar>
+            <w:vAlign w:val="center"/>
+          </w:tcPr>
+          <w:p>
+            <w:pPr>
+              <w:spacing w:after="0" w:line="260"/>
+              <w:jc w:val="left"/>
+            </w:pPr>
+            <w:r>
+              <w:rPr>
+                <w:rFonts w:ascii="Calibri" w:cs="Calibri" w:eastAsia="Calibri" w:hAnsi="Calibri"/>
+                <w:sz w:val="21"/>
+                <w:szCs w:val="21"/>
+              </w:rPr>
+              <w:t xml:space="preserve">v1.0.1</w:t>
+            </w:r>
+          </w:p>
+        </w:tc>
+        <w:tc>
+          <w:tcPr>
+            <w:tcW w:type="dxa" w:w="2200"/>
+            <w:tcBorders>
+              <w:top w:val="single" w:color="BBB5A8" w:sz="4"/>
+              <w:left w:val="single" w:color="BBB5A8" w:sz="4"/>
+              <w:bottom w:val="single" w:color="BBB5A8" w:sz="4"/>
+              <w:right w:val="single" w:color="BBB5A8" w:sz="4"/>
+            </w:tcBorders>
+            <w:tcMar>
+              <w:top w:type="dxa" w:w="70"/>
+              <w:left w:type="dxa" w:w="110"/>
+              <w:bottom w:type="dxa" w:w="70"/>
+              <w:right w:type="dxa" w:w="110"/>
+            </w:tcMar>
+            <w:vAlign w:val="center"/>
+          </w:tcPr>
+          <w:p>
+            <w:pPr>
+              <w:spacing w:after="0" w:line="260"/>
+              <w:jc w:val="left"/>
+            </w:pPr>
+            <w:r>
+              <w:rPr>
+                <w:rFonts w:ascii="Calibri" w:cs="Calibri" w:eastAsia="Calibri" w:hAnsi="Calibri"/>
+                <w:sz w:val="21"/>
+                <w:szCs w:val="21"/>
+              </w:rPr>
+              <w:t xml:space="preserve">Outubro de 2026</w:t>
+            </w:r>
+          </w:p>
+        </w:tc>
+        <w:tc>
+          <w:tcPr>
+            <w:tcW w:type="dxa" w:w="5806"/>
+            <w:tcBorders>
+              <w:top w:val="single" w:color="BBB5A8" w:sz="4"/>
+              <w:left w:val="single" w:color="BBB5A8" w:sz="4"/>
+              <w:bottom w:val="single" w:color="BBB5A8" w:sz="4"/>
+              <w:right w:val="single" w:color="BBB5A8" w:sz="4"/>
+            </w:tcBorders>
+            <w:tcMar>
+              <w:top w:type="dxa" w:w="70"/>
+              <w:left w:type="dxa" w:w="110"/>
+              <w:bottom w:type="dxa" w:w="70"/>
+              <w:right w:type="dxa" w:w="110"/>
+            </w:tcMar>
+            <w:vAlign w:val="center"/>
+          </w:tcPr>
+          <w:p>
+            <w:pPr>
+              <w:spacing w:after="0" w:line="260"/>
+              <w:jc w:val="left"/>
+            </w:pPr>
+            <w:r>
+              <w:rPr>
+                <w:rFonts w:ascii="Calibri" w:cs="Calibri" w:eastAsia="Calibri" w:hAnsi="Calibri"/>
+                <w:sz w:val="21"/>
+                <w:szCs w:val="21"/>
+              </w:rPr>
+              <w:t xml:space="preserve">Acrescenta o DOI do Zenodo (nota da edição e como citar). Sem mudanças no conteúdo das fases.</w:t>
             </w:r>
           </w:p>
         </w:tc>
@@ -10855,7 +10956,7 @@
         <w:sz w:val="18"/>
         <w:szCs w:val="18"/>
       </w:rPr>
-      <w:t xml:space="preserve">MÉTODO A.L.V.O.R. · v1.0</w:t>
+      <w:t xml:space="preserve">MÉTODO A.L.V.O.R. · v1.0.1</w:t>
     </w:r>
   </w:p>
 </w:hdr>
@@ -10880,7 +10981,7 @@
         <w:sz w:val="18"/>
         <w:szCs w:val="18"/>
       </w:rPr>
-      <w:t xml:space="preserve">MÉTODO A.L.V.O.R. · v1.0</w:t>
+      <w:t xml:space="preserve">MÉTODO A.L.V.O.R. · v1.0.1</w:t>
     </w:r>
   </w:p>
 </w:hdr>

</xml_diff>